<commit_message>
Kumar filing: signature blocks right of midline with four-line signing space
Co-Authored-By: Claude Opus 5.5 <noreply@anthropic.com>
Claude-Session: https://claude.ai/code/session_019TLqP2S94uHc4BMEoK9cMK
</commit_message>
<xml_diff>
--- a/case-files/kumar-v-us/filing-v2/3-KUMAR-RESPONSE-EDITABLE.docx
+++ b/case-files/kumar-v-us/filing-v2/3-KUMAR-RESPONSE-EDITABLE.docx
@@ -1722,8 +1722,8 @@
     </w:p>
     <w:p>
       <w:pPr>
-        <w:spacing w:after="200" w:line="480" w:lineRule="auto"/>
-        <w:ind w:firstLine="720"/>
+        <w:spacing w:after="200" w:line="320" w:lineRule="auto"/>
+        <w:ind w:left="4680"/>
         <w:jc w:val="left"/>
       </w:pPr>
       <w:r>
@@ -1736,9 +1736,22 @@
     </w:p>
     <w:p>
       <w:pPr>
-        <w:spacing w:after="200" w:line="360" w:lineRule="auto"/>
-        <w:jc w:val="left"/>
-      </w:pPr>
+        <w:spacing w:after="200" w:line="320" w:lineRule="auto"/>
+        <w:ind w:left="4680"/>
+        <w:jc w:val="left"/>
+      </w:pPr>
+      <w:r>
+        <w:br/>
+      </w:r>
+      <w:r>
+        <w:br/>
+      </w:r>
+      <w:r>
+        <w:br/>
+      </w:r>
+      <w:r>
+        <w:br/>
+      </w:r>
       <w:r>
         <w:rPr>
           <w:rFonts w:ascii="Times New Roman" w:hAnsi="Times New Roman"/>
@@ -1799,8 +1812,8 @@
     </w:p>
     <w:p>
       <w:pPr>
-        <w:spacing w:after="200" w:line="480" w:lineRule="auto"/>
-        <w:ind w:firstLine="720"/>
+        <w:spacing w:after="200" w:line="320" w:lineRule="auto"/>
+        <w:ind w:left="4680"/>
         <w:jc w:val="left"/>
       </w:pPr>
       <w:r>
@@ -1846,9 +1859,22 @@
     </w:p>
     <w:p>
       <w:pPr>
-        <w:spacing w:after="200" w:line="360" w:lineRule="auto"/>
-        <w:jc w:val="left"/>
-      </w:pPr>
+        <w:spacing w:after="200" w:line="320" w:lineRule="auto"/>
+        <w:ind w:left="4680"/>
+        <w:jc w:val="left"/>
+      </w:pPr>
+      <w:r>
+        <w:br/>
+      </w:r>
+      <w:r>
+        <w:br/>
+      </w:r>
+      <w:r>
+        <w:br/>
+      </w:r>
+      <w:r>
+        <w:br/>
+      </w:r>
       <w:r>
         <w:rPr>
           <w:rFonts w:ascii="Times New Roman" w:hAnsi="Times New Roman"/>
@@ -1939,9 +1965,22 @@
     </w:p>
     <w:p>
       <w:pPr>
-        <w:spacing w:after="200" w:line="360" w:lineRule="auto"/>
-        <w:jc w:val="left"/>
-      </w:pPr>
+        <w:spacing w:after="200" w:line="320" w:lineRule="auto"/>
+        <w:ind w:left="4680"/>
+        <w:jc w:val="left"/>
+      </w:pPr>
+      <w:r>
+        <w:br/>
+      </w:r>
+      <w:r>
+        <w:br/>
+      </w:r>
+      <w:r>
+        <w:br/>
+      </w:r>
+      <w:r>
+        <w:br/>
+      </w:r>
       <w:r>
         <w:rPr>
           <w:rFonts w:ascii="Times New Roman" w:hAnsi="Times New Roman"/>
@@ -2244,9 +2283,22 @@
     </w:p>
     <w:p>
       <w:pPr>
-        <w:spacing w:after="200" w:line="360" w:lineRule="auto"/>
-        <w:jc w:val="left"/>
-      </w:pPr>
+        <w:spacing w:after="200" w:line="320" w:lineRule="auto"/>
+        <w:ind w:left="4680"/>
+        <w:jc w:val="left"/>
+      </w:pPr>
+      <w:r>
+        <w:br/>
+      </w:r>
+      <w:r>
+        <w:br/>
+      </w:r>
+      <w:r>
+        <w:br/>
+      </w:r>
+      <w:r>
+        <w:br/>
+      </w:r>
       <w:r>
         <w:rPr>
           <w:rFonts w:ascii="Times New Roman" w:hAnsi="Times New Roman"/>

</xml_diff>